<commit_message>
Update admin panel layout and integrate logo for restaurant chatbot
</commit_message>
<xml_diff>
--- a/SRS (Software Requirements Specification)/SRS (Software Requirements Specification).docx
+++ b/SRS (Software Requirements Specification)/SRS (Software Requirements Specification).docx
@@ -1,6 +1,6 @@
 
 <file path=word/document.xml><?xml version="1.0" encoding="utf-8"?>
-<w:document xmlns:wpc="http://schemas.microsoft.com/office/word/2010/wordprocessingCanvas" xmlns:cx="http://schemas.microsoft.com/office/drawing/2014/chartex" xmlns:mc="http://schemas.openxmlformats.org/markup-compatibility/2006" xmlns:o="urn:schemas-microsoft-com:office:office" xmlns:r="http://schemas.openxmlformats.org/officeDocument/2006/relationships" xmlns:m="http://schemas.openxmlformats.org/officeDocument/2006/math" xmlns:v="urn:schemas-microsoft-com:vml" xmlns:wp14="http://schemas.microsoft.com/office/word/2010/wordprocessingDrawing" xmlns:wp="http://schemas.openxmlformats.org/drawingml/2006/wordprocessingDrawing" xmlns:w10="urn:schemas-microsoft-com:office:word" xmlns:w="http://schemas.openxmlformats.org/wordprocessingml/2006/main" xmlns:w14="http://schemas.microsoft.com/office/word/2010/wordml" xmlns:w15="http://schemas.microsoft.com/office/word/2012/wordml" xmlns:w16se="http://schemas.microsoft.com/office/word/2015/wordml/symex" xmlns:wpg="http://schemas.microsoft.com/office/word/2010/wordprocessingGroup" xmlns:wpi="http://schemas.microsoft.com/office/word/2010/wordprocessingInk" xmlns:wne="http://schemas.microsoft.com/office/word/2006/wordml" xmlns:wps="http://schemas.microsoft.com/office/word/2010/wordprocessingShape" mc:Ignorable="w14 w15 w16se wp14">
+<w:document xmlns:wpc="http://schemas.microsoft.com/office/word/2010/wordprocessingCanvas" xmlns:cx="http://schemas.microsoft.com/office/drawing/2014/chartex" xmlns:cx1="http://schemas.microsoft.com/office/drawing/2015/9/8/chartex" xmlns:cx2="http://schemas.microsoft.com/office/drawing/2015/10/21/chartex" xmlns:cx3="http://schemas.microsoft.com/office/drawing/2016/5/9/chartex" xmlns:cx4="http://schemas.microsoft.com/office/drawing/2016/5/10/chartex" xmlns:cx5="http://schemas.microsoft.com/office/drawing/2016/5/11/chartex" xmlns:cx6="http://schemas.microsoft.com/office/drawing/2016/5/12/chartex" xmlns:cx7="http://schemas.microsoft.com/office/drawing/2016/5/13/chartex" xmlns:cx8="http://schemas.microsoft.com/office/drawing/2016/5/14/chartex" xmlns:mc="http://schemas.openxmlformats.org/markup-compatibility/2006" xmlns:aink="http://schemas.microsoft.com/office/drawing/2016/ink" xmlns:am3d="http://schemas.microsoft.com/office/drawing/2017/model3d" xmlns:o="urn:schemas-microsoft-com:office:office" xmlns:r="http://schemas.openxmlformats.org/officeDocument/2006/relationships" xmlns:m="http://schemas.openxmlformats.org/officeDocument/2006/math" xmlns:v="urn:schemas-microsoft-com:vml" xmlns:wp14="http://schemas.microsoft.com/office/word/2010/wordprocessingDrawing" xmlns:wp="http://schemas.openxmlformats.org/drawingml/2006/wordprocessingDrawing" xmlns:w10="urn:schemas-microsoft-com:office:word" xmlns:w="http://schemas.openxmlformats.org/wordprocessingml/2006/main" xmlns:w14="http://schemas.microsoft.com/office/word/2010/wordml" xmlns:w15="http://schemas.microsoft.com/office/word/2012/wordml" xmlns:w16cid="http://schemas.microsoft.com/office/word/2016/wordml/cid" xmlns:w16se="http://schemas.microsoft.com/office/word/2015/wordml/symex" xmlns:wpg="http://schemas.microsoft.com/office/word/2010/wordprocessingGroup" xmlns:wpi="http://schemas.microsoft.com/office/word/2010/wordprocessingInk" xmlns:wne="http://schemas.microsoft.com/office/word/2006/wordml" xmlns:wps="http://schemas.microsoft.com/office/word/2010/wordprocessingShape" mc:Ignorable="w14 w15 w16se w16cid wp14">
   <w:body>
     <w:p>
       <w:pPr>
@@ -16,7 +16,21 @@
           <w:rFonts w:ascii="Times New Roman" w:hAnsi="Times New Roman" w:cs="Times New Roman"/>
           <w:bCs w:val="0"/>
         </w:rPr>
-        <w:t xml:space="preserve">NLP Chatbot Development Using Dialogflow </w:t>
+        <w:t xml:space="preserve">NLP Chatbot Development Using </w:t>
+      </w:r>
+      <w:r>
+        <w:rPr>
+          <w:rFonts w:ascii="Times New Roman" w:hAnsi="Times New Roman" w:cs="Times New Roman"/>
+          <w:bCs w:val="0"/>
+        </w:rPr>
+        <w:t>Dialog flow</w:t>
+      </w:r>
+      <w:r>
+        <w:rPr>
+          <w:rFonts w:ascii="Times New Roman" w:hAnsi="Times New Roman" w:cs="Times New Roman"/>
+          <w:bCs w:val="0"/>
+        </w:rPr>
+        <w:t xml:space="preserve"> </w:t>
       </w:r>
     </w:p>
     <w:p>
@@ -37,7 +51,25 @@
           <w:sz w:val="36"/>
           <w:szCs w:val="36"/>
         </w:rPr>
-        <w:t>Software Requirements Specification</w:t>
+        <w:t>Softwar</w:t>
+      </w:r>
+      <w:r>
+        <w:rPr>
+          <w:b/>
+          <w:bCs/>
+          <w:sz w:val="36"/>
+          <w:szCs w:val="36"/>
+        </w:rPr>
+        <w:t>e</w:t>
+      </w:r>
+      <w:r>
+        <w:rPr>
+          <w:b/>
+          <w:bCs/>
+          <w:sz w:val="36"/>
+          <w:szCs w:val="36"/>
+        </w:rPr>
+        <w:t xml:space="preserve"> Requirements Specification</w:t>
       </w:r>
     </w:p>
     <w:p>
@@ -141,7 +173,7 @@
             <v:path o:extrusionok="f" gradientshapeok="t" o:connecttype="rect"/>
             <o:lock v:ext="edit" aspectratio="t"/>
           </v:shapetype>
-          <v:shape id="_x0000_i1025" type="#_x0000_t75" style="width:154.5pt;height:96.75pt">
+          <v:shape id="_x0000_i1025" type="#_x0000_t75" style="width:154.4pt;height:96.65pt">
             <v:imagedata r:id="rId8" o:title="vu_logo"/>
           </v:shape>
         </w:pict>
@@ -410,7 +442,27 @@
                 <w:sz w:val="24"/>
                 <w:szCs w:val="24"/>
               </w:rPr>
-              <w:t>Date (dd/mm/yyyy)</w:t>
+              <w:t>Date (dd/mm/</w:t>
+            </w:r>
+            <w:proofErr w:type="spellStart"/>
+            <w:r>
+              <w:rPr>
+                <w:b/>
+                <w:bCs/>
+                <w:sz w:val="24"/>
+                <w:szCs w:val="24"/>
+              </w:rPr>
+              <w:t>yyyy</w:t>
+            </w:r>
+            <w:proofErr w:type="spellEnd"/>
+            <w:r>
+              <w:rPr>
+                <w:b/>
+                <w:bCs/>
+                <w:sz w:val="24"/>
+                <w:szCs w:val="24"/>
+              </w:rPr>
+              <w:t>)</w:t>
             </w:r>
           </w:p>
         </w:tc>
@@ -1278,7 +1330,25 @@
             <w:sz w:val="32"/>
             <w:szCs w:val="32"/>
           </w:rPr>
-          <w:t xml:space="preserve"> Non Functional requirements</w:t>
+          <w:t xml:space="preserve"> </w:t>
+        </w:r>
+        <w:proofErr w:type="gramStart"/>
+        <w:r>
+          <w:rPr>
+            <w:rStyle w:val="Hyperlink"/>
+            <w:sz w:val="32"/>
+            <w:szCs w:val="32"/>
+          </w:rPr>
+          <w:t>Non Functional</w:t>
+        </w:r>
+        <w:proofErr w:type="gramEnd"/>
+        <w:r>
+          <w:rPr>
+            <w:rStyle w:val="Hyperlink"/>
+            <w:sz w:val="32"/>
+            <w:szCs w:val="32"/>
+          </w:rPr>
+          <w:t xml:space="preserve"> requirements</w:t>
         </w:r>
         <w:r>
           <w:rPr>
@@ -1756,7 +1826,23 @@
           <w:sz w:val="26"/>
           <w:szCs w:val="26"/>
         </w:rPr>
-        <w:t>This project focuses on developing an AI-powered chatbot for the restaurant industry, designed to improve customer service and streamline restaurant operations. The chatbot will use Google Dialogflow, a powerful natural language processing (NLP) tool, to understand and respond to user inquiries in a conversational way. The primary aim is to automate essential tasks such as table reservations, order placements, and answering frequently asked questions (FAQs), enhancing customer satisfaction and reducing the workload for restaurant staff. The backend system will be built using Python, while the frontend will be developed using HTML, CSS, and JavaScript, ensuring a seamless and user-friendly interface.</w:t>
+        <w:t xml:space="preserve">This project focuses on developing an AI-powered chatbot for the restaurant industry, designed to improve customer service and streamline restaurant operations. The chatbot will use Google </w:t>
+      </w:r>
+      <w:proofErr w:type="spellStart"/>
+      <w:r>
+        <w:rPr>
+          <w:sz w:val="26"/>
+          <w:szCs w:val="26"/>
+        </w:rPr>
+        <w:t>Dialogflow</w:t>
+      </w:r>
+      <w:proofErr w:type="spellEnd"/>
+      <w:r>
+        <w:rPr>
+          <w:sz w:val="26"/>
+          <w:szCs w:val="26"/>
+        </w:rPr>
+        <w:t>, a powerful natural language processing (NLP) tool, to understand and respond to user inquiries in a conversational way. The primary aim is to automate essential tasks such as table reservations, order placements, and answering frequently asked questions (FAQs), enhancing customer satisfaction and reducing the workload for restaurant staff. The backend system will be built using Python, while the frontend will be developed using HTML, CSS, and JavaScript, ensuring a seamless and user-friendly interface.</w:t>
       </w:r>
     </w:p>
     <w:p>
@@ -3224,7 +3310,6 @@
     </w:p>
     <w:p>
       <w:pPr>
-        <w:jc w:val="center"/>
         <w:rPr>
           <w:b/>
           <w:bCs/>
@@ -3240,8 +3325,18 @@
         <w:rPr>
           <w:b/>
           <w:bCs/>
-          <w:sz w:val="28"/>
-          <w:szCs w:val="28"/>
+          <w:sz w:val="22"/>
+          <w:szCs w:val="22"/>
+          <w:u w:val="double"/>
+        </w:rPr>
+      </w:pPr>
+    </w:p>
+    <w:p>
+      <w:pPr>
+        <w:jc w:val="center"/>
+        <w:rPr>
+          <w:b/>
+          <w:bCs/>
           <w:u w:val="double"/>
           <w:lang w:val="en-PK"/>
         </w:rPr>
@@ -3250,8 +3345,6 @@
         <w:rPr>
           <w:b/>
           <w:bCs/>
-          <w:sz w:val="28"/>
-          <w:szCs w:val="28"/>
           <w:u w:val="double"/>
         </w:rPr>
         <w:lastRenderedPageBreak/>
@@ -3265,22 +3358,10 @@
         <w:pStyle w:val="NormalWeb"/>
         <w:jc w:val="lowKashida"/>
       </w:pPr>
-    </w:p>
-    <w:p>
-      <w:pPr>
-        <w:pStyle w:val="NormalWeb"/>
-        <w:jc w:val="lowKashida"/>
-      </w:pPr>
-    </w:p>
-    <w:p>
-      <w:pPr>
-        <w:pStyle w:val="NormalWeb"/>
-        <w:jc w:val="lowKashida"/>
-      </w:pPr>
-      <w:r>
-        <w:pict w14:anchorId="385B7CF7">
-          <v:shape id="_x0000_i1026" type="#_x0000_t75" style="width:491.25pt;height:556.5pt">
-            <v:imagedata r:id="rId9" o:title="NLP_Chatbot"/>
+      <w:r>
+        <w:pict w14:anchorId="1CC6089C">
+          <v:shape id="_x0000_i1026" type="#_x0000_t75" style="width:490.75pt;height:614.35pt">
+            <v:imagedata r:id="rId9" o:title="usecase_diagram"/>
           </v:shape>
         </w:pict>
       </w:r>
@@ -8988,23 +9069,51 @@
           <w:szCs w:val="28"/>
           <w:u w:val="single"/>
         </w:rPr>
-        <w:t>Adopted Methodology for NLP Chatbot Development using Dialogflow</w:t>
-      </w:r>
-    </w:p>
-    <w:p>
-      <w:pPr>
-        <w:pStyle w:val="NormalWeb"/>
-        <w:rPr>
-          <w:sz w:val="26"/>
-          <w:szCs w:val="26"/>
-        </w:rPr>
-      </w:pPr>
-      <w:r>
-        <w:rPr>
-          <w:sz w:val="26"/>
-          <w:szCs w:val="26"/>
-        </w:rPr>
-        <w:t>For the development of the NLP Chatbot using Dialogflow, I have chosen a hybrid methodology that combines two well-known software development models: Rapid Prototyping and Incremental Model. This combination ensures quick development, early user feedback, and flexibility in making improvements as the project progresses. Here’s a detailed explanation of the adopted methodology and how it applies to the chatbot development project:</w:t>
+        <w:t xml:space="preserve">Adopted Methodology for NLP Chatbot Development using </w:t>
+      </w:r>
+      <w:proofErr w:type="spellStart"/>
+      <w:r>
+        <w:rPr>
+          <w:b/>
+          <w:bCs/>
+          <w:sz w:val="28"/>
+          <w:szCs w:val="28"/>
+          <w:u w:val="single"/>
+        </w:rPr>
+        <w:t>Dialogflow</w:t>
+      </w:r>
+      <w:proofErr w:type="spellEnd"/>
+    </w:p>
+    <w:p>
+      <w:pPr>
+        <w:pStyle w:val="NormalWeb"/>
+        <w:rPr>
+          <w:sz w:val="26"/>
+          <w:szCs w:val="26"/>
+        </w:rPr>
+      </w:pPr>
+      <w:r>
+        <w:rPr>
+          <w:sz w:val="26"/>
+          <w:szCs w:val="26"/>
+        </w:rPr>
+        <w:t xml:space="preserve">For the development of the NLP Chatbot using </w:t>
+      </w:r>
+      <w:proofErr w:type="spellStart"/>
+      <w:r>
+        <w:rPr>
+          <w:sz w:val="26"/>
+          <w:szCs w:val="26"/>
+        </w:rPr>
+        <w:t>Dialogflow</w:t>
+      </w:r>
+      <w:proofErr w:type="spellEnd"/>
+      <w:r>
+        <w:rPr>
+          <w:sz w:val="26"/>
+          <w:szCs w:val="26"/>
+        </w:rPr>
+        <w:t>, I have chosen a hybrid methodology that combines two well-known software development models: Rapid Prototyping and Incremental Model. This combination ensures quick development, early user feedback, and flexibility in making improvements as the project progresses. Here’s a detailed explanation of the adopted methodology and how it applies to the chatbot development project:</w:t>
       </w:r>
     </w:p>
     <w:p>
@@ -9076,8 +9185,6 @@
           <w:szCs w:val="26"/>
         </w:rPr>
       </w:pPr>
-      <w:bookmarkStart w:id="5" w:name="_GoBack"/>
-      <w:bookmarkEnd w:id="5"/>
     </w:p>
     <w:p>
       <w:pPr>
@@ -9121,7 +9228,23 @@
           <w:sz w:val="26"/>
           <w:szCs w:val="26"/>
         </w:rPr>
-        <w:t xml:space="preserve"> The first step is to create a simple version of the chatbot using Dialogflow. The initial prototype will be limited in functionality, with just the basic interactions, such as answering frequently asked questions (FAQs) and providing basic information (like the restaurant's hours or menu items).</w:t>
+        <w:t xml:space="preserve"> The first step is to create a simple version of the chatbot using </w:t>
+      </w:r>
+      <w:proofErr w:type="spellStart"/>
+      <w:r>
+        <w:rPr>
+          <w:sz w:val="26"/>
+          <w:szCs w:val="26"/>
+        </w:rPr>
+        <w:t>Dialogflow</w:t>
+      </w:r>
+      <w:proofErr w:type="spellEnd"/>
+      <w:r>
+        <w:rPr>
+          <w:sz w:val="26"/>
+          <w:szCs w:val="26"/>
+        </w:rPr>
+        <w:t>. The initial prototype will be limited in functionality, with just the basic interactions, such as answering frequently asked questions (FAQs) and providing basic information (like the restaurant's hours or menu items).</w:t>
       </w:r>
     </w:p>
     <w:p>
@@ -9305,7 +9428,7 @@
           <w:noProof/>
         </w:rPr>
         <w:pict w14:anchorId="195FAFBC">
-          <v:shape id="Picture 1" o:spid="_x0000_i1027" type="#_x0000_t75" style="width:264.75pt;height:245.25pt;visibility:visible;mso-wrap-style:square">
+          <v:shape id="Picture 1" o:spid="_x0000_i1027" type="#_x0000_t75" style="width:264.3pt;height:245.35pt;visibility:visible;mso-wrap-style:square">
             <v:imagedata r:id="rId10" o:title=""/>
           </v:shape>
         </w:pict>
@@ -9550,7 +9673,16 @@
           <w:sz w:val="26"/>
           <w:szCs w:val="26"/>
         </w:rPr>
-        <w:t>The Incremental Model is applied after the prototype is developed. In this model, the chatbot is built in small, manageable parts (increments), with each increment adding new features and functionality to the existing system.</w:t>
+        <w:t xml:space="preserve">The Incremental Model is applied after the </w:t>
+      </w:r>
+      <w:bookmarkStart w:id="5" w:name="_GoBack"/>
+      <w:bookmarkEnd w:id="5"/>
+      <w:r>
+        <w:rPr>
+          <w:sz w:val="26"/>
+          <w:szCs w:val="26"/>
+        </w:rPr>
+        <w:t>prototype is developed. In this model, the chatbot is built in small, manageable parts (increments), with each increment adding new features and functionality to the existing system.</w:t>
       </w:r>
     </w:p>
     <w:p>
@@ -9726,7 +9858,7 @@
           <w:noProof/>
         </w:rPr>
         <w:pict w14:anchorId="470CCF59">
-          <v:shape id="_x0000_i1028" type="#_x0000_t75" style="width:330.75pt;height:231pt;visibility:visible;mso-wrap-style:square">
+          <v:shape id="_x0000_i1028" type="#_x0000_t75" style="width:330.65pt;height:230.7pt;visibility:visible;mso-wrap-style:square">
             <v:imagedata r:id="rId11" o:title=""/>
           </v:shape>
         </w:pict>
@@ -9845,7 +9977,23 @@
           <w:sz w:val="26"/>
           <w:szCs w:val="26"/>
         </w:rPr>
-        <w:t xml:space="preserve"> Since each new feature is added incrementally, it’s easier to identify and fix bugs. If an issue arises after adding a feature, it’s simpler to pinpoint which increment caused the problem.</w:t>
+        <w:t xml:space="preserve"> Since each new feature </w:t>
+      </w:r>
+      <w:proofErr w:type="gramStart"/>
+      <w:r>
+        <w:rPr>
+          <w:sz w:val="26"/>
+          <w:szCs w:val="26"/>
+        </w:rPr>
+        <w:t>is</w:t>
+      </w:r>
+      <w:proofErr w:type="gramEnd"/>
+      <w:r>
+        <w:rPr>
+          <w:sz w:val="26"/>
+          <w:szCs w:val="26"/>
+        </w:rPr>
+        <w:t xml:space="preserve"> added incrementally, it’s easier to identify and fix bugs. If an issue arises after adding a feature, it’s simpler to pinpoint which increment caused the problem.</w:t>
       </w:r>
     </w:p>
     <w:p>
@@ -10276,7 +10424,7 @@
       </w:pPr>
       <w:r>
         <w:pict w14:anchorId="3DC91DB3">
-          <v:shape id="_x0000_i1029" type="#_x0000_t75" style="width:492.75pt;height:173.25pt">
+          <v:shape id="_x0000_i1029" type="#_x0000_t75" style="width:493.1pt;height:173.35pt">
             <v:imagedata r:id="rId12" o:title="Project Progress Overview NLP Chatbot Development Using Dialogflow 20241202"/>
           </v:shape>
         </w:pict>
@@ -10285,6 +10433,15 @@
     <w:p>
       <w:pPr>
         <w:pStyle w:val="NormalWeb"/>
+      </w:pPr>
+    </w:p>
+    <w:p>
+      <w:pPr>
+        <w:jc w:val="both"/>
+        <w:rPr>
+          <w:sz w:val="28"/>
+          <w:szCs w:val="28"/>
+        </w:rPr>
       </w:pPr>
     </w:p>
     <w:p>
@@ -10307,7 +10464,7 @@
 </file>
 
 <file path=word/endnotes.xml><?xml version="1.0" encoding="utf-8"?>
-<w:endnotes xmlns:wpc="http://schemas.microsoft.com/office/word/2010/wordprocessingCanvas" xmlns:cx="http://schemas.microsoft.com/office/drawing/2014/chartex" xmlns:mc="http://schemas.openxmlformats.org/markup-compatibility/2006" xmlns:o="urn:schemas-microsoft-com:office:office" xmlns:r="http://schemas.openxmlformats.org/officeDocument/2006/relationships" xmlns:m="http://schemas.openxmlformats.org/officeDocument/2006/math" xmlns:v="urn:schemas-microsoft-com:vml" xmlns:wp14="http://schemas.microsoft.com/office/word/2010/wordprocessingDrawing" xmlns:wp="http://schemas.openxmlformats.org/drawingml/2006/wordprocessingDrawing" xmlns:w10="urn:schemas-microsoft-com:office:word" xmlns:w="http://schemas.openxmlformats.org/wordprocessingml/2006/main" xmlns:w14="http://schemas.microsoft.com/office/word/2010/wordml" xmlns:w15="http://schemas.microsoft.com/office/word/2012/wordml" xmlns:w16se="http://schemas.microsoft.com/office/word/2015/wordml/symex" xmlns:wpg="http://schemas.microsoft.com/office/word/2010/wordprocessingGroup" xmlns:wpi="http://schemas.microsoft.com/office/word/2010/wordprocessingInk" xmlns:wne="http://schemas.microsoft.com/office/word/2006/wordml" xmlns:wps="http://schemas.microsoft.com/office/word/2010/wordprocessingShape" mc:Ignorable="w14 w15 w16se wp14">
+<w:endnotes xmlns:wpc="http://schemas.microsoft.com/office/word/2010/wordprocessingCanvas" xmlns:cx="http://schemas.microsoft.com/office/drawing/2014/chartex" xmlns:cx1="http://schemas.microsoft.com/office/drawing/2015/9/8/chartex" xmlns:cx2="http://schemas.microsoft.com/office/drawing/2015/10/21/chartex" xmlns:cx3="http://schemas.microsoft.com/office/drawing/2016/5/9/chartex" xmlns:cx4="http://schemas.microsoft.com/office/drawing/2016/5/10/chartex" xmlns:cx5="http://schemas.microsoft.com/office/drawing/2016/5/11/chartex" xmlns:cx6="http://schemas.microsoft.com/office/drawing/2016/5/12/chartex" xmlns:cx7="http://schemas.microsoft.com/office/drawing/2016/5/13/chartex" xmlns:cx8="http://schemas.microsoft.com/office/drawing/2016/5/14/chartex" xmlns:mc="http://schemas.openxmlformats.org/markup-compatibility/2006" xmlns:aink="http://schemas.microsoft.com/office/drawing/2016/ink" xmlns:am3d="http://schemas.microsoft.com/office/drawing/2017/model3d" xmlns:o="urn:schemas-microsoft-com:office:office" xmlns:r="http://schemas.openxmlformats.org/officeDocument/2006/relationships" xmlns:m="http://schemas.openxmlformats.org/officeDocument/2006/math" xmlns:v="urn:schemas-microsoft-com:vml" xmlns:wp14="http://schemas.microsoft.com/office/word/2010/wordprocessingDrawing" xmlns:wp="http://schemas.openxmlformats.org/drawingml/2006/wordprocessingDrawing" xmlns:w10="urn:schemas-microsoft-com:office:word" xmlns:w="http://schemas.openxmlformats.org/wordprocessingml/2006/main" xmlns:w14="http://schemas.microsoft.com/office/word/2010/wordml" xmlns:w15="http://schemas.microsoft.com/office/word/2012/wordml" xmlns:w16cid="http://schemas.microsoft.com/office/word/2016/wordml/cid" xmlns:w16se="http://schemas.microsoft.com/office/word/2015/wordml/symex" xmlns:wpg="http://schemas.microsoft.com/office/word/2010/wordprocessingGroup" xmlns:wpi="http://schemas.microsoft.com/office/word/2010/wordprocessingInk" xmlns:wne="http://schemas.microsoft.com/office/word/2006/wordml" xmlns:wps="http://schemas.microsoft.com/office/word/2010/wordprocessingShape" mc:Ignorable="w14 w15 w16se w16cid wp14">
   <w:endnote w:type="separator" w:id="-1">
     <w:p>
       <w:r>
@@ -10326,7 +10483,7 @@
 </file>
 
 <file path=word/footnotes.xml><?xml version="1.0" encoding="utf-8"?>
-<w:footnotes xmlns:wpc="http://schemas.microsoft.com/office/word/2010/wordprocessingCanvas" xmlns:cx="http://schemas.microsoft.com/office/drawing/2014/chartex" xmlns:mc="http://schemas.openxmlformats.org/markup-compatibility/2006" xmlns:o="urn:schemas-microsoft-com:office:office" xmlns:r="http://schemas.openxmlformats.org/officeDocument/2006/relationships" xmlns:m="http://schemas.openxmlformats.org/officeDocument/2006/math" xmlns:v="urn:schemas-microsoft-com:vml" xmlns:wp14="http://schemas.microsoft.com/office/word/2010/wordprocessingDrawing" xmlns:wp="http://schemas.openxmlformats.org/drawingml/2006/wordprocessingDrawing" xmlns:w10="urn:schemas-microsoft-com:office:word" xmlns:w="http://schemas.openxmlformats.org/wordprocessingml/2006/main" xmlns:w14="http://schemas.microsoft.com/office/word/2010/wordml" xmlns:w15="http://schemas.microsoft.com/office/word/2012/wordml" xmlns:w16se="http://schemas.microsoft.com/office/word/2015/wordml/symex" xmlns:wpg="http://schemas.microsoft.com/office/word/2010/wordprocessingGroup" xmlns:wpi="http://schemas.microsoft.com/office/word/2010/wordprocessingInk" xmlns:wne="http://schemas.microsoft.com/office/word/2006/wordml" xmlns:wps="http://schemas.microsoft.com/office/word/2010/wordprocessingShape" mc:Ignorable="w14 w15 w16se wp14">
+<w:footnotes xmlns:wpc="http://schemas.microsoft.com/office/word/2010/wordprocessingCanvas" xmlns:cx="http://schemas.microsoft.com/office/drawing/2014/chartex" xmlns:cx1="http://schemas.microsoft.com/office/drawing/2015/9/8/chartex" xmlns:cx2="http://schemas.microsoft.com/office/drawing/2015/10/21/chartex" xmlns:cx3="http://schemas.microsoft.com/office/drawing/2016/5/9/chartex" xmlns:cx4="http://schemas.microsoft.com/office/drawing/2016/5/10/chartex" xmlns:cx5="http://schemas.microsoft.com/office/drawing/2016/5/11/chartex" xmlns:cx6="http://schemas.microsoft.com/office/drawing/2016/5/12/chartex" xmlns:cx7="http://schemas.microsoft.com/office/drawing/2016/5/13/chartex" xmlns:cx8="http://schemas.microsoft.com/office/drawing/2016/5/14/chartex" xmlns:mc="http://schemas.openxmlformats.org/markup-compatibility/2006" xmlns:aink="http://schemas.microsoft.com/office/drawing/2016/ink" xmlns:am3d="http://schemas.microsoft.com/office/drawing/2017/model3d" xmlns:o="urn:schemas-microsoft-com:office:office" xmlns:r="http://schemas.openxmlformats.org/officeDocument/2006/relationships" xmlns:m="http://schemas.openxmlformats.org/officeDocument/2006/math" xmlns:v="urn:schemas-microsoft-com:vml" xmlns:wp14="http://schemas.microsoft.com/office/word/2010/wordprocessingDrawing" xmlns:wp="http://schemas.openxmlformats.org/drawingml/2006/wordprocessingDrawing" xmlns:w10="urn:schemas-microsoft-com:office:word" xmlns:w="http://schemas.openxmlformats.org/wordprocessingml/2006/main" xmlns:w14="http://schemas.microsoft.com/office/word/2010/wordml" xmlns:w15="http://schemas.microsoft.com/office/word/2012/wordml" xmlns:w16cid="http://schemas.microsoft.com/office/word/2016/wordml/cid" xmlns:w16se="http://schemas.microsoft.com/office/word/2015/wordml/symex" xmlns:wpg="http://schemas.microsoft.com/office/word/2010/wordprocessingGroup" xmlns:wpi="http://schemas.microsoft.com/office/word/2010/wordprocessingInk" xmlns:wne="http://schemas.microsoft.com/office/word/2006/wordml" xmlns:wps="http://schemas.microsoft.com/office/word/2010/wordprocessingShape" mc:Ignorable="w14 w15 w16se w16cid wp14">
   <w:footnote w:type="separator" w:id="-1">
     <w:p>
       <w:r>
@@ -10345,7 +10502,7 @@
 </file>
 
 <file path=word/numbering.xml><?xml version="1.0" encoding="utf-8"?>
-<w:numbering xmlns:wpc="http://schemas.microsoft.com/office/word/2010/wordprocessingCanvas" xmlns:cx="http://schemas.microsoft.com/office/drawing/2014/chartex" xmlns:mc="http://schemas.openxmlformats.org/markup-compatibility/2006" xmlns:o="urn:schemas-microsoft-com:office:office" xmlns:r="http://schemas.openxmlformats.org/officeDocument/2006/relationships" xmlns:m="http://schemas.openxmlformats.org/officeDocument/2006/math" xmlns:v="urn:schemas-microsoft-com:vml" xmlns:wp14="http://schemas.microsoft.com/office/word/2010/wordprocessingDrawing" xmlns:wp="http://schemas.openxmlformats.org/drawingml/2006/wordprocessingDrawing" xmlns:w10="urn:schemas-microsoft-com:office:word" xmlns:w="http://schemas.openxmlformats.org/wordprocessingml/2006/main" xmlns:w14="http://schemas.microsoft.com/office/word/2010/wordml" xmlns:w15="http://schemas.microsoft.com/office/word/2012/wordml" xmlns:w16se="http://schemas.microsoft.com/office/word/2015/wordml/symex" xmlns:wpg="http://schemas.microsoft.com/office/word/2010/wordprocessingGroup" xmlns:wpi="http://schemas.microsoft.com/office/word/2010/wordprocessingInk" xmlns:wne="http://schemas.microsoft.com/office/word/2006/wordml" xmlns:wps="http://schemas.microsoft.com/office/word/2010/wordprocessingShape" mc:Ignorable="w14 w15 w16se wp14">
+<w:numbering xmlns:wpc="http://schemas.microsoft.com/office/word/2010/wordprocessingCanvas" xmlns:cx="http://schemas.microsoft.com/office/drawing/2014/chartex" xmlns:cx1="http://schemas.microsoft.com/office/drawing/2015/9/8/chartex" xmlns:cx2="http://schemas.microsoft.com/office/drawing/2015/10/21/chartex" xmlns:cx3="http://schemas.microsoft.com/office/drawing/2016/5/9/chartex" xmlns:cx4="http://schemas.microsoft.com/office/drawing/2016/5/10/chartex" xmlns:cx5="http://schemas.microsoft.com/office/drawing/2016/5/11/chartex" xmlns:cx6="http://schemas.microsoft.com/office/drawing/2016/5/12/chartex" xmlns:cx7="http://schemas.microsoft.com/office/drawing/2016/5/13/chartex" xmlns:cx8="http://schemas.microsoft.com/office/drawing/2016/5/14/chartex" xmlns:mc="http://schemas.openxmlformats.org/markup-compatibility/2006" xmlns:aink="http://schemas.microsoft.com/office/drawing/2016/ink" xmlns:am3d="http://schemas.microsoft.com/office/drawing/2017/model3d" xmlns:o="urn:schemas-microsoft-com:office:office" xmlns:r="http://schemas.openxmlformats.org/officeDocument/2006/relationships" xmlns:m="http://schemas.openxmlformats.org/officeDocument/2006/math" xmlns:v="urn:schemas-microsoft-com:vml" xmlns:wp14="http://schemas.microsoft.com/office/word/2010/wordprocessingDrawing" xmlns:wp="http://schemas.openxmlformats.org/drawingml/2006/wordprocessingDrawing" xmlns:w10="urn:schemas-microsoft-com:office:word" xmlns:w="http://schemas.openxmlformats.org/wordprocessingml/2006/main" xmlns:w14="http://schemas.microsoft.com/office/word/2010/wordml" xmlns:w15="http://schemas.microsoft.com/office/word/2012/wordml" xmlns:w16cid="http://schemas.microsoft.com/office/word/2016/wordml/cid" xmlns:w16se="http://schemas.microsoft.com/office/word/2015/wordml/symex" xmlns:wpg="http://schemas.microsoft.com/office/word/2010/wordprocessingGroup" xmlns:wpi="http://schemas.microsoft.com/office/word/2010/wordprocessingInk" xmlns:wne="http://schemas.microsoft.com/office/word/2006/wordml" xmlns:wps="http://schemas.microsoft.com/office/word/2010/wordprocessingShape" mc:Ignorable="w14 w15 w16se w16cid wp14">
   <w:abstractNum w:abstractNumId="0" w15:restartNumberingAfterBreak="0">
     <w:nsid w:val="17024A17"/>
     <w:multiLevelType w:val="hybridMultilevel"/>
@@ -10882,17 +11039,17 @@
 </file>
 
 <file path=word/styles.xml><?xml version="1.0" encoding="utf-8"?>
-<w:styles xmlns:mc="http://schemas.openxmlformats.org/markup-compatibility/2006" xmlns:r="http://schemas.openxmlformats.org/officeDocument/2006/relationships" xmlns:w="http://schemas.openxmlformats.org/wordprocessingml/2006/main" xmlns:w14="http://schemas.microsoft.com/office/word/2010/wordml" xmlns:w15="http://schemas.microsoft.com/office/word/2012/wordml" xmlns:w16se="http://schemas.microsoft.com/office/word/2015/wordml/symex" mc:Ignorable="w14 w15 w16se">
+<w:styles xmlns:mc="http://schemas.openxmlformats.org/markup-compatibility/2006" xmlns:r="http://schemas.openxmlformats.org/officeDocument/2006/relationships" xmlns:w="http://schemas.openxmlformats.org/wordprocessingml/2006/main" xmlns:w14="http://schemas.microsoft.com/office/word/2010/wordml" xmlns:w15="http://schemas.microsoft.com/office/word/2012/wordml" xmlns:w16cid="http://schemas.microsoft.com/office/word/2016/wordml/cid" xmlns:w16se="http://schemas.microsoft.com/office/word/2015/wordml/symex" mc:Ignorable="w14 w15 w16se w16cid">
   <w:docDefaults>
     <w:rPrDefault>
       <w:rPr>
         <w:rFonts w:ascii="Times New Roman" w:eastAsia="Times New Roman" w:hAnsi="Times New Roman" w:cs="Times New Roman"/>
-        <w:lang w:val="en-US" w:eastAsia="en-US" w:bidi="ar-SA"/>
+        <w:lang w:val="en-PK" w:eastAsia="en-PK" w:bidi="ar-SA"/>
       </w:rPr>
     </w:rPrDefault>
     <w:pPrDefault/>
   </w:docDefaults>
-  <w:latentStyles w:defLockedState="0" w:defUIPriority="0" w:defSemiHidden="0" w:defUnhideWhenUsed="0" w:defQFormat="0" w:count="371">
+  <w:latentStyles w:defLockedState="0" w:defUIPriority="0" w:defSemiHidden="0" w:defUnhideWhenUsed="0" w:defQFormat="0" w:count="375">
     <w:lsdException w:name="Normal" w:qFormat="1"/>
     <w:lsdException w:name="heading 1" w:qFormat="1"/>
     <w:lsdException w:name="heading 2" w:semiHidden="1" w:unhideWhenUsed="1" w:qFormat="1"/>
@@ -10909,7 +11066,12 @@
     <w:lsdException w:name="Strong" w:uiPriority="22" w:qFormat="1"/>
     <w:lsdException w:name="Emphasis" w:uiPriority="20" w:qFormat="1"/>
     <w:lsdException w:name="Normal (Web)" w:uiPriority="99"/>
+    <w:lsdException w:name="HTML Preformatted" w:semiHidden="1" w:unhideWhenUsed="1"/>
     <w:lsdException w:name="Normal Table" w:semiHidden="1" w:unhideWhenUsed="1"/>
+    <w:lsdException w:name="No List" w:semiHidden="1" w:unhideWhenUsed="1"/>
+    <w:lsdException w:name="Outline List 1" w:semiHidden="1" w:unhideWhenUsed="1"/>
+    <w:lsdException w:name="Outline List 2" w:semiHidden="1" w:unhideWhenUsed="1"/>
+    <w:lsdException w:name="Outline List 3" w:semiHidden="1" w:unhideWhenUsed="1"/>
     <w:lsdException w:name="Table Simple 1" w:semiHidden="1" w:unhideWhenUsed="1"/>
     <w:lsdException w:name="Table Simple 2" w:semiHidden="1" w:unhideWhenUsed="1"/>
     <w:lsdException w:name="Table Simple 3" w:semiHidden="1" w:unhideWhenUsed="1"/>
@@ -11168,6 +11330,10 @@
     <w:lsdException w:name="List Table 5 Dark Accent 6" w:uiPriority="50"/>
     <w:lsdException w:name="List Table 6 Colorful Accent 6" w:uiPriority="51"/>
     <w:lsdException w:name="List Table 7 Colorful Accent 6" w:uiPriority="52"/>
+    <w:lsdException w:name="Mention" w:semiHidden="1" w:uiPriority="99" w:unhideWhenUsed="1"/>
+    <w:lsdException w:name="Smart Hyperlink" w:semiHidden="1" w:uiPriority="99" w:unhideWhenUsed="1"/>
+    <w:lsdException w:name="Hashtag" w:semiHidden="1" w:uiPriority="99" w:unhideWhenUsed="1"/>
+    <w:lsdException w:name="Unresolved Mention" w:semiHidden="1" w:uiPriority="99" w:unhideWhenUsed="1"/>
   </w:latentStyles>
   <w:style w:type="paragraph" w:default="1" w:styleId="Normal">
     <w:name w:val="Normal"/>
@@ -11176,6 +11342,7 @@
     <w:rPr>
       <w:sz w:val="24"/>
       <w:szCs w:val="24"/>
+      <w:lang w:val="en-US" w:eastAsia="en-US"/>
     </w:rPr>
   </w:style>
   <w:style w:type="paragraph" w:styleId="Heading3">
@@ -11693,7 +11860,7 @@
 </file>
 
 <file path=customXml/itemProps1.xml><?xml version="1.0" encoding="utf-8"?>
-<ds:datastoreItem xmlns:ds="http://schemas.openxmlformats.org/officeDocument/2006/customXml" ds:itemID="{13D15DB3-9E1F-43BD-8C55-A751466F8DDA}">
+<ds:datastoreItem xmlns:ds="http://schemas.openxmlformats.org/officeDocument/2006/customXml" ds:itemID="{DBA8D57E-95AC-446A-86FE-FBB4BEAFA003}">
   <ds:schemaRefs>
     <ds:schemaRef ds:uri="http://schemas.openxmlformats.org/officeDocument/2006/bibliography"/>
   </ds:schemaRefs>

</xml_diff>